<commit_message>
docs: ajusta el guion del video 3 del modulo 2 a lo que muestra el mazo
La diapositiva 1 decia que a la derecha estaban las fotos; el mazo muestra
las cifras de los datos. Se corrige la frase en las dos versiones del guion,
se regeneran los documentos de Word y se anotan en el plan visual la
diapositiva 4 (mapas de los bloques) y la 6 (dibujo en lugar de foto).
</commit_message>
<xml_diff>
--- a/docs/capacitacion/guion youtube/modulo-2-teoria-con-mas-detalle/video-3-aprendizaje-por-transferencia/modulo-2-video-3-aprendizaje-por-transferencia.docx
+++ b/docs/capacitacion/guion youtube/modulo-2-teoria-con-mas-detalle/video-3-aprendizaje-por-transferencia/modulo-2-video-3-aprendizaje-por-transferencia.docx
@@ -25,7 +25,7 @@
         <w:rPr>
           <w:i/>
         </w:rPr>
-        <w:t>3,369 palabras, unos 19.3 min de habla</w:t>
+        <w:t>3,377 palabras, unos 19.3 min de habla</w:t>
       </w:r>
     </w:p>
     <w:p>
@@ -61,7 +61,7 @@
     </w:p>
     <w:p>
       <w:r>
-        <w:t>En pantalla están los números que plantean el problema. Del lado izquierdo, una red con 43.9 millones de pesos. Del derecho, las fotos de las que disponemos: en el cuaderno de entrenamiento que usamos de ejemplo, cuatro fotos de fluorescencia con 258 espermatozoides etiquetados. Más adelante revisamos esos números con calma. Por ahora quedémonos con la desproporción: muchísimos pesos y muy pocos ejemplos.</w:t>
+        <w:t>En pantalla están los números que plantean el problema. Del lado izquierdo, una red con 43.9 millones de pesos. Del derecho, nuestros datos, los del cuaderno de entrenamiento que usamos de ejemplo: cuatro fotos de fluorescencia con 258 espermatozoides etiquetados, de los que 163 se usan para entrenar y 64 para validar. Más adelante revisamos esos números con calma. Por ahora quedémonos con la desproporción: muchísimos pesos y muy pocos ejemplos.</w:t>
       </w:r>
     </w:p>
     <w:p>

</xml_diff>